<commit_message>
Update food extract templates and unnumbered personnel lists
</commit_message>
<xml_diff>
--- a/Documents/Templates/Extracts [food]/{yyyy}-{mm}-{dd} {OrderNumber} (зачислить на продовольствие [ЧУЖИЕ] - {Raporter}) {Signatory}.docx
+++ b/Documents/Templates/Extracts [food]/{yyyy}-{mm}-{dd} {OrderNumber} (зачислить на продовольствие [ЧУЖИЕ] - {Raporter}) {Signatory}.docx
@@ -450,21 +450,7 @@
           <w:sz w:val="28"/>
           <w:szCs w:val="28"/>
         </w:rPr>
-        <w:t>{EnrollmentDate}</w:t>
-      </w:r>
-      <w:r>
-        <w:rPr>
-          <w:sz w:val="28"/>
-          <w:szCs w:val="28"/>
-        </w:rPr>
-        <w:t/>
-      </w:r>
-      <w:r>
-        <w:rPr>
-          <w:sz w:val="28"/>
-          <w:szCs w:val="28"/>
-        </w:rPr>
-        <w:t>:</w:t>
+        <w:t>{EnrollmentDate}:</w:t>
       </w:r>
     </w:p>
     <w:p>
@@ -777,7 +763,7 @@
                 <w:sz w:val="28"/>
                 <w:szCs w:val="28"/>
               </w:rPr>
-              <w:t>Начальник відділення персоналу штабу</w:t>
+              <w:t>Тимчасово виконуючий обов’язки начальника відділення персоналу штабу</w:t>
             </w:r>
           </w:p>
         </w:tc>
@@ -936,7 +922,7 @@
                 <w:sz w:val="28"/>
                 <w:szCs w:val="28"/>
               </w:rPr>
-              <w:t>Вячеслав ЦОПА</w:t>
+              <w:t>Сергій ПОНОМАРЬОВ</w:t>
             </w:r>
           </w:p>
         </w:tc>

</xml_diff>